<commit_message>
Teste doc. atualizado 28/02
</commit_message>
<xml_diff>
--- a/pw2/teste.docx
+++ b/pw2/teste.docx
@@ -60,13 +60,36 @@
       <w:proofErr w:type="spellEnd"/>
       <w:proofErr w:type="gramEnd"/>
       <w:r>
-        <w:t>)</w:t>
-      </w:r>
+        <w:t xml:space="preserve">) </w:t>
+      </w:r>
+      <w:proofErr w:type="spellStart"/>
+      <w:r>
+        <w:t>Git</w:t>
+      </w:r>
+      <w:proofErr w:type="spellEnd"/>
       <w:r>
         <w:t xml:space="preserve"> </w:t>
       </w:r>
       <w:proofErr w:type="spellStart"/>
       <w:r>
+        <w:t>branch</w:t>
+      </w:r>
+      <w:proofErr w:type="spellEnd"/>
+      <w:r>
+        <w:t xml:space="preserve"> Daniel</w:t>
+      </w:r>
+    </w:p>
+    <w:p>
+      <w:pPr>
+        <w:pBdr>
+          <w:top w:val="single" w:sz="4" w:space="1" w:color="auto"/>
+          <w:left w:val="single" w:sz="4" w:space="4" w:color="auto"/>
+          <w:bottom w:val="single" w:sz="4" w:space="1" w:color="auto"/>
+          <w:right w:val="single" w:sz="4" w:space="4" w:color="auto"/>
+        </w:pBdr>
+      </w:pPr>
+      <w:proofErr w:type="spellStart"/>
+      <w:r>
         <w:t>Git</w:t>
       </w:r>
       <w:proofErr w:type="spellEnd"/>
@@ -78,111 +101,74 @@
         <w:t>branch</w:t>
       </w:r>
       <w:proofErr w:type="spellEnd"/>
+    </w:p>
+    <w:p>
+      <w:pPr>
+        <w:pBdr>
+          <w:top w:val="single" w:sz="4" w:space="1" w:color="auto"/>
+          <w:left w:val="single" w:sz="4" w:space="4" w:color="auto"/>
+          <w:bottom w:val="single" w:sz="4" w:space="1" w:color="auto"/>
+          <w:right w:val="single" w:sz="4" w:space="4" w:color="auto"/>
+        </w:pBdr>
+      </w:pPr>
+      <w:r>
+        <w:t xml:space="preserve">“Aparece as duas </w:t>
+      </w:r>
+      <w:proofErr w:type="spellStart"/>
+      <w:r>
+        <w:t>branch</w:t>
+      </w:r>
+      <w:proofErr w:type="spellEnd"/>
+      <w:r>
+        <w:t xml:space="preserve"> criadas </w:t>
+      </w:r>
+      <w:proofErr w:type="spellStart"/>
+      <w:r>
+        <w:t>Main</w:t>
+      </w:r>
+      <w:proofErr w:type="spellEnd"/>
+      <w:r>
+        <w:t xml:space="preserve"> e Daniel”</w:t>
+      </w:r>
+    </w:p>
+    <w:p>
+      <w:pPr>
+        <w:pBdr>
+          <w:top w:val="single" w:sz="4" w:space="1" w:color="auto"/>
+          <w:left w:val="single" w:sz="4" w:space="4" w:color="auto"/>
+          <w:bottom w:val="single" w:sz="4" w:space="1" w:color="auto"/>
+          <w:right w:val="single" w:sz="4" w:space="4" w:color="auto"/>
+        </w:pBdr>
+      </w:pPr>
+      <w:r>
+        <w:t>(</w:t>
+      </w:r>
+      <w:proofErr w:type="spellStart"/>
+      <w:r>
+        <w:t>main</w:t>
+      </w:r>
+      <w:proofErr w:type="spellEnd"/>
+      <w:r>
+        <w:t xml:space="preserve">) </w:t>
+      </w:r>
+      <w:proofErr w:type="spellStart"/>
+      <w:r>
+        <w:t>Git</w:t>
+      </w:r>
+      <w:proofErr w:type="spellEnd"/>
+      <w:r>
+        <w:t xml:space="preserve"> </w:t>
+      </w:r>
+      <w:proofErr w:type="spellStart"/>
+      <w:r>
+        <w:t>checkout</w:t>
+      </w:r>
+      <w:proofErr w:type="spellEnd"/>
       <w:r>
         <w:t xml:space="preserve"> Daniel</w:t>
       </w:r>
-    </w:p>
-    <w:p>
-      <w:pPr>
-        <w:pBdr>
-          <w:top w:val="single" w:sz="4" w:space="1" w:color="auto"/>
-          <w:left w:val="single" w:sz="4" w:space="4" w:color="auto"/>
-          <w:bottom w:val="single" w:sz="4" w:space="1" w:color="auto"/>
-          <w:right w:val="single" w:sz="4" w:space="4" w:color="auto"/>
-        </w:pBdr>
-      </w:pPr>
-      <w:proofErr w:type="spellStart"/>
-      <w:r>
-        <w:t>Git</w:t>
-      </w:r>
-      <w:proofErr w:type="spellEnd"/>
-      <w:r>
-        <w:t xml:space="preserve"> </w:t>
-      </w:r>
-      <w:proofErr w:type="spellStart"/>
-      <w:r>
-        <w:t>branch</w:t>
-      </w:r>
-      <w:proofErr w:type="spellEnd"/>
-    </w:p>
-    <w:p>
-      <w:pPr>
-        <w:pBdr>
-          <w:top w:val="single" w:sz="4" w:space="1" w:color="auto"/>
-          <w:left w:val="single" w:sz="4" w:space="4" w:color="auto"/>
-          <w:bottom w:val="single" w:sz="4" w:space="1" w:color="auto"/>
-          <w:right w:val="single" w:sz="4" w:space="4" w:color="auto"/>
-        </w:pBdr>
-      </w:pPr>
-      <w:r>
-        <w:t xml:space="preserve">“Aparece as duas </w:t>
-      </w:r>
-      <w:proofErr w:type="spellStart"/>
-      <w:r>
-        <w:t>branch</w:t>
-      </w:r>
-      <w:proofErr w:type="spellEnd"/>
-      <w:r>
-        <w:t xml:space="preserve"> criadas </w:t>
-      </w:r>
-      <w:proofErr w:type="spellStart"/>
-      <w:r>
-        <w:t>Main</w:t>
-      </w:r>
-      <w:proofErr w:type="spellEnd"/>
-      <w:r>
-        <w:t xml:space="preserve"> e Daniel”</w:t>
-      </w:r>
-    </w:p>
-    <w:p>
-      <w:pPr>
-        <w:pBdr>
-          <w:top w:val="single" w:sz="4" w:space="1" w:color="auto"/>
-          <w:left w:val="single" w:sz="4" w:space="4" w:color="auto"/>
-          <w:bottom w:val="single" w:sz="4" w:space="1" w:color="auto"/>
-          <w:right w:val="single" w:sz="4" w:space="4" w:color="auto"/>
-        </w:pBdr>
-      </w:pPr>
-      <w:r>
-        <w:t>(</w:t>
-      </w:r>
-      <w:proofErr w:type="spellStart"/>
-      <w:proofErr w:type="gramStart"/>
-      <w:r>
-        <w:t>main</w:t>
-      </w:r>
-      <w:proofErr w:type="spellEnd"/>
-      <w:proofErr w:type="gramEnd"/>
-      <w:r>
-        <w:t>)</w:t>
-      </w:r>
-      <w:r>
-        <w:t xml:space="preserve"> </w:t>
-      </w:r>
-      <w:proofErr w:type="spellStart"/>
-      <w:r>
-        <w:t>Git</w:t>
-      </w:r>
-      <w:proofErr w:type="spellEnd"/>
-      <w:r>
-        <w:t xml:space="preserve"> </w:t>
-      </w:r>
-      <w:proofErr w:type="spellStart"/>
-      <w:r>
-        <w:t>checkout</w:t>
-      </w:r>
-      <w:proofErr w:type="spellEnd"/>
-      <w:r>
-        <w:t xml:space="preserve"> </w:t>
-      </w:r>
-      <w:proofErr w:type="spellStart"/>
-      <w:r>
-        <w:t>Daniel</w:t>
-      </w:r>
-      <w:r>
-        <w:t>git</w:t>
-      </w:r>
-      <w:proofErr w:type="spellEnd"/>
+      <w:bookmarkStart w:id="0" w:name="_GoBack"/>
+      <w:bookmarkEnd w:id="0"/>
       <w:r>
         <w:t xml:space="preserve"> </w:t>
       </w:r>
@@ -635,8 +621,6 @@
       <w:r>
         <w:t>Daniel</w:t>
       </w:r>
-      <w:bookmarkStart w:id="0" w:name="_GoBack"/>
-      <w:bookmarkEnd w:id="0"/>
     </w:p>
     <w:p>
       <w:r>

</xml_diff>